<commit_message>
Throttle lastOnlineOn updates and coalesce telemetry saves per MAC to stop welding_machine lock storms.
Full entity UPDATE on every poll blocked concurrent saveMachineState transactions and let stale snapshots pile up in the async queue, so DB history lagged behind live panel-state. Use a narrow JPQL touch for last_online_on (30s throttle) and keep only the latest pending save per device.
</commit_message>
<xml_diff>
--- a/docs/daily-stats-algorithms.docx
+++ b/docs/daily-stats-algorithms.docx
@@ -574,6 +574,168 @@
         <w:rPr>
           <w:b/>
         </w:rPr>
+        <w:t xml:space="preserve">Замощение суток. </w:t>
+      </w:r>
+      <w:r>
+        <w:rPr>
+          <w:b w:val="0"/>
+        </w:rPr>
+        <w:t xml:space="preserve">Чтобы сумма таймеров равнялась прошедшему времени </w:t>
+      </w:r>
+      <w:r>
+        <w:rPr>
+          <w:rFonts w:ascii="Consolas" w:hAnsi="Consolas"/>
+          <w:b w:val="0"/>
+          <w:sz w:val="20"/>
+        </w:rPr>
+        <w:t>[00:01, effectiveEnd]</w:t>
+      </w:r>
+      <w:r>
+        <w:rPr>
+          <w:b w:val="0"/>
+        </w:rPr>
+        <w:t xml:space="preserve">, непокрытое телеметрией время относится к </w:t>
+      </w:r>
+      <w:r>
+        <w:rPr>
+          <w:rFonts w:ascii="Consolas" w:hAnsi="Consolas"/>
+          <w:b w:val="0"/>
+          <w:sz w:val="20"/>
+        </w:rPr>
+        <w:t>off</w:t>
+      </w:r>
+      <w:r>
+        <w:rPr>
+          <w:b w:val="0"/>
+        </w:rPr>
+        <w:t xml:space="preserve"> («Выкл./не в сети»):</w:t>
+      </w:r>
+    </w:p>
+    <w:p>
+      <w:pPr>
+        <w:pStyle w:val="ListBullet2"/>
+        <w:spacing w:after="40"/>
+      </w:pPr>
+      <w:r>
+        <w:rPr>
+          <w:b w:val="0"/>
+        </w:rPr>
+        <w:t xml:space="preserve">голова </w:t>
+      </w:r>
+      <w:r>
+        <w:rPr>
+          <w:rFonts w:ascii="Consolas" w:hAnsi="Consolas"/>
+          <w:b w:val="0"/>
+          <w:sz w:val="20"/>
+        </w:rPr>
+        <w:t>[00:01 → первый пакет дня]</w:t>
+      </w:r>
+      <w:r>
+        <w:rPr>
+          <w:b w:val="0"/>
+        </w:rPr>
+        <w:t>;</w:t>
+      </w:r>
+    </w:p>
+    <w:p>
+      <w:pPr>
+        <w:pStyle w:val="ListBullet2"/>
+        <w:spacing w:after="40"/>
+      </w:pPr>
+      <w:r>
+        <w:rPr>
+          <w:b w:val="0"/>
+        </w:rPr>
+        <w:t xml:space="preserve">хвост </w:t>
+      </w:r>
+      <w:r>
+        <w:rPr>
+          <w:rFonts w:ascii="Consolas" w:hAnsi="Consolas"/>
+          <w:b w:val="0"/>
+          <w:sz w:val="20"/>
+        </w:rPr>
+        <w:t>[последний покрытый момент → effectiveEnd]</w:t>
+      </w:r>
+      <w:r>
+        <w:rPr>
+          <w:b w:val="0"/>
+        </w:rPr>
+        <w:t xml:space="preserve"> (последний покрытый момент = </w:t>
+      </w:r>
+      <w:r>
+        <w:rPr>
+          <w:rFonts w:ascii="Consolas" w:hAnsi="Consolas"/>
+          <w:b w:val="0"/>
+          <w:sz w:val="20"/>
+        </w:rPr>
+        <w:t>dateCreated</w:t>
+      </w:r>
+      <w:r>
+        <w:rPr>
+          <w:b w:val="0"/>
+        </w:rPr>
+        <w:t xml:space="preserve"> последнего состояния + его </w:t>
+      </w:r>
+      <w:r>
+        <w:rPr>
+          <w:rFonts w:ascii="Consolas" w:hAnsi="Consolas"/>
+          <w:b w:val="0"/>
+          <w:sz w:val="20"/>
+        </w:rPr>
+        <w:t>stateDurationMs</w:t>
+      </w:r>
+      <w:r>
+        <w:rPr>
+          <w:b w:val="0"/>
+        </w:rPr>
+        <w:t xml:space="preserve">; хвост до </w:t>
+      </w:r>
+      <w:r>
+        <w:rPr>
+          <w:rFonts w:ascii="Consolas" w:hAnsi="Consolas"/>
+          <w:b w:val="0"/>
+          <w:sz w:val="20"/>
+        </w:rPr>
+        <w:t>now</w:t>
+      </w:r>
+      <w:r>
+        <w:rPr>
+          <w:b w:val="0"/>
+        </w:rPr>
+        <w:t xml:space="preserve"> намеренно не тянется, иначе таймеры «скачут»);</w:t>
+      </w:r>
+    </w:p>
+    <w:p>
+      <w:pPr>
+        <w:pStyle w:val="ListBullet2"/>
+        <w:spacing w:after="40"/>
+      </w:pPr>
+      <w:r>
+        <w:rPr>
+          <w:b w:val="0"/>
+        </w:rPr>
+        <w:t>весь интервал суток, если пакетов не было вовсе.</w:t>
+      </w:r>
+    </w:p>
+    <w:p>
+      <w:pPr>
+        <w:spacing w:after="120"/>
+      </w:pPr>
+      <w:r>
+        <w:rPr>
+          <w:b w:val="0"/>
+        </w:rPr>
+        <w:t>Штатные короткие зазоры между опросами уже учтены через «зазор до следующего состояния».</w:t>
+      </w:r>
+    </w:p>
+    <w:p>
+      <w:pPr>
+        <w:spacing w:after="120"/>
+      </w:pPr>
+      <w:r>
+        <w:rPr>
+          <w:b/>
+        </w:rPr>
         <w:t xml:space="preserve">Итог. </w:t>
       </w:r>
       <w:r>
@@ -1038,7 +1200,21 @@
         <w:rPr>
           <w:b w:val="0"/>
         </w:rPr>
-        <w:t>Расход проволоки считается только по времени сварки, через скорость подачи и линейную плотность проволоки.</w:t>
+        <w:t>Параметр «Расход проволоки» (</w:t>
+      </w:r>
+      <w:r>
+        <w:rPr>
+          <w:rFonts w:ascii="Consolas" w:hAnsi="Consolas"/>
+          <w:b w:val="0"/>
+          <w:sz w:val="20"/>
+        </w:rPr>
+        <w:t>WIRE_PARAM</w:t>
+      </w:r>
+      <w:r>
+        <w:rPr>
+          <w:b w:val="0"/>
+        </w:rPr>
+        <w:t>) с аппарата — это накопительная длина поданной проволоки в метрах «с момента включения» (uint32 из пакета Core, декодированный как IEEE-float), а НЕ мгновенная скорость. Значение монотонно растёт при сварке и стоит в простое, обнуляется при перезагрузке аппарата. Поэтому расход считается по дельтам счётчика, как газ.</w:t>
       </w:r>
     </w:p>
     <w:p>
@@ -1055,7 +1231,7 @@
         <w:rPr>
           <w:b w:val="0"/>
         </w:rPr>
-        <w:t xml:space="preserve">Те же состояния за сутки </w:t>
+        <w:t xml:space="preserve">Состояния за сутки </w:t>
       </w:r>
       <w:r>
         <w:rPr>
@@ -1063,13 +1239,13 @@
           <w:b w:val="0"/>
           <w:sz w:val="20"/>
         </w:rPr>
-        <w:t>[dayStart, effectiveEnd)</w:t>
+        <w:t>[dayStart, dayEnd)</w:t>
       </w:r>
       <w:r>
         <w:rPr>
           <w:b w:val="0"/>
         </w:rPr>
-        <w:t>. Для каждого подгружается параметр «Расход проволоки» (</w:t>
+        <w:t xml:space="preserve"> по времени. Для каждого подгружается значение счётчика «Расход проволоки» (обычный маппинг + fallback на нативный </w:t>
       </w:r>
       <w:r>
         <w:rPr>
@@ -1077,13 +1253,13 @@
           <w:b w:val="0"/>
           <w:sz w:val="20"/>
         </w:rPr>
-        <w:t>WIRE_PARAM</w:t>
+        <w:t>COALESCE</w:t>
       </w:r>
       <w:r>
         <w:rPr>
           <w:b w:val="0"/>
         </w:rPr>
-        <w:t>) — это скорость подачи в метрах в минуту (m/min). Если через обычный маппинг значение не нашлось, есть fallback на нативный SQL-запрос с COALESCE.</w:t>
+        <w:t>).</w:t>
       </w:r>
     </w:p>
     <w:p>
@@ -1114,7 +1290,21 @@
         <w:rPr>
           <w:b w:val="0"/>
         </w:rPr>
-        <w:t xml:space="preserve"> = 0.000089 кг/м (из конфигурации).</w:t>
+        <w:t xml:space="preserve"> = 0.0089 кг/м (сталь Ø1.2 мм, из конфигурации </w:t>
+      </w:r>
+      <w:r>
+        <w:rPr>
+          <w:rFonts w:ascii="Consolas" w:hAnsi="Consolas"/>
+          <w:b w:val="0"/>
+          <w:sz w:val="20"/>
+        </w:rPr>
+        <w:t>report.wire.linear-density-kg-per-meter</w:t>
+      </w:r>
+      <w:r>
+        <w:rPr>
+          <w:b w:val="0"/>
+        </w:rPr>
+        <w:t>).</w:t>
       </w:r>
     </w:p>
     <w:p>
@@ -1125,13 +1315,21 @@
         <w:rPr>
           <w:b/>
         </w:rPr>
-        <w:t xml:space="preserve">Проход по состояниям. </w:t>
+        <w:t xml:space="preserve">Проход по состояниям (по возрастанию времени), </w:t>
+      </w:r>
+      <w:r>
+        <w:rPr>
+          <w:rFonts w:ascii="Consolas" w:hAnsi="Consolas"/>
+          <w:b w:val="0"/>
+          <w:sz w:val="20"/>
+        </w:rPr>
+        <w:t>sumWireCumulativeMeters</w:t>
       </w:r>
       <w:r>
         <w:rPr>
           <w:b w:val="0"/>
         </w:rPr>
-        <w:t>Для каждого состояния:</w:t>
+        <w:t>:</w:t>
       </w:r>
     </w:p>
     <w:p>
@@ -1143,7 +1341,7 @@
         <w:rPr>
           <w:b w:val="0"/>
         </w:rPr>
-        <w:t>Учитываются только состояния со статусом Welding (остальные пропускаются).</w:t>
+        <w:t>Для каждой пары последовательных значений счётчика берётся дельта.</w:t>
       </w:r>
     </w:p>
     <w:p>
@@ -1155,7 +1353,7 @@
         <w:rPr>
           <w:b w:val="0"/>
         </w:rPr>
-        <w:t xml:space="preserve">Считается перекрытие длительности с окном суток (та же </w:t>
+        <w:t xml:space="preserve">Если счётчик вырос → прибавляем </w:t>
       </w:r>
       <w:r>
         <w:rPr>
@@ -1163,73 +1361,7 @@
           <w:b w:val="0"/>
           <w:sz w:val="20"/>
         </w:rPr>
-        <w:t>overlapDurationMs</w:t>
-      </w:r>
-      <w:r>
-        <w:rPr>
-          <w:b w:val="0"/>
-        </w:rPr>
-        <w:t xml:space="preserve">, </w:t>
-      </w:r>
-      <w:r>
-        <w:rPr>
-          <w:rFonts w:ascii="Consolas" w:hAnsi="Consolas"/>
-          <w:b w:val="0"/>
-          <w:sz w:val="20"/>
-        </w:rPr>
-        <w:t>openEndIfLast = null</w:t>
-      </w:r>
-      <w:r>
-        <w:rPr>
-          <w:b w:val="0"/>
-        </w:rPr>
-        <w:t>). Если ≤ 0 — пропуск.</w:t>
-      </w:r>
-    </w:p>
-    <w:p>
-      <w:pPr>
-        <w:pStyle w:val="ListNumber"/>
-        <w:spacing w:after="40"/>
-      </w:pPr>
-      <w:r>
-        <w:rPr>
-          <w:b w:val="0"/>
-        </w:rPr>
-        <w:t xml:space="preserve">Берётся скорость подачи </w:t>
-      </w:r>
-      <w:r>
-        <w:rPr>
-          <w:rFonts w:ascii="Consolas" w:hAnsi="Consolas"/>
-          <w:b w:val="0"/>
-          <w:sz w:val="20"/>
-        </w:rPr>
-        <w:t>mpm</w:t>
-      </w:r>
-      <w:r>
-        <w:rPr>
-          <w:b w:val="0"/>
-        </w:rPr>
-        <w:t xml:space="preserve"> для этого состояния; если её нет или ≤ 0 — пропуск.</w:t>
-      </w:r>
-    </w:p>
-    <w:p>
-      <w:pPr>
-        <w:pStyle w:val="ListNumber"/>
-        <w:spacing w:after="40"/>
-      </w:pPr>
-      <w:r>
-        <w:rPr>
-          <w:b w:val="0"/>
-        </w:rPr>
-        <w:t xml:space="preserve">Длительность перекрытия переводится в минуты: </w:t>
-      </w:r>
-      <w:r>
-        <w:rPr>
-          <w:rFonts w:ascii="Consolas" w:hAnsi="Consolas"/>
-          <w:b w:val="0"/>
-          <w:sz w:val="20"/>
-        </w:rPr>
-        <w:t>minutes = overlapMs / 60000</w:t>
+        <w:t>current − last</w:t>
       </w:r>
       <w:r>
         <w:rPr>
@@ -1247,7 +1379,7 @@
         <w:rPr>
           <w:b w:val="0"/>
         </w:rPr>
-        <w:t xml:space="preserve">Масса на этом отрезке = </w:t>
+        <w:t xml:space="preserve">Если счётчик крупно упал (более чем вдвое, </w:t>
       </w:r>
       <w:r>
         <w:rPr>
@@ -1255,13 +1387,65 @@
           <w:b w:val="0"/>
           <w:sz w:val="20"/>
         </w:rPr>
-        <w:t>mpm × density × minutes</w:t>
+        <w:t>current &lt; last × 0.5</w:t>
       </w:r>
       <w:r>
         <w:rPr>
           <w:b w:val="0"/>
         </w:rPr>
-        <w:t>, прибавляется к общей сумме.</w:t>
+        <w:t xml:space="preserve">) — это перезагрузка «с включения» → прибавляем само </w:t>
+      </w:r>
+      <w:r>
+        <w:rPr>
+          <w:rFonts w:ascii="Consolas" w:hAnsi="Consolas"/>
+          <w:b w:val="0"/>
+          <w:sz w:val="20"/>
+        </w:rPr>
+        <w:t>current</w:t>
+      </w:r>
+      <w:r>
+        <w:rPr>
+          <w:b w:val="0"/>
+        </w:rPr>
+        <w:t>.</w:t>
+      </w:r>
+    </w:p>
+    <w:p>
+      <w:pPr>
+        <w:pStyle w:val="ListNumber"/>
+        <w:spacing w:after="40"/>
+      </w:pPr>
+      <w:r>
+        <w:rPr>
+          <w:b w:val="0"/>
+        </w:rPr>
+        <w:t xml:space="preserve">Мелкая просадка (шум/обрыв связи) → игнор, причём </w:t>
+      </w:r>
+      <w:r>
+        <w:rPr>
+          <w:rFonts w:ascii="Consolas" w:hAnsi="Consolas"/>
+          <w:b w:val="0"/>
+          <w:sz w:val="20"/>
+        </w:rPr>
+        <w:t>last</w:t>
+      </w:r>
+      <w:r>
+        <w:rPr>
+          <w:b w:val="0"/>
+        </w:rPr>
+        <w:t xml:space="preserve"> вниз не двигаем (иначе шумовой «отскок» даст ложный прирост).</w:t>
+      </w:r>
+    </w:p>
+    <w:p>
+      <w:pPr>
+        <w:pStyle w:val="ListNumber"/>
+        <w:spacing w:after="40"/>
+      </w:pPr>
+      <w:r>
+        <w:rPr>
+          <w:b w:val="0"/>
+        </w:rPr>
+        <w:t>Сумма приростов = поданная за сутки длина проволоки (м).</w:t>
       </w:r>
     </w:p>
     <w:p>
@@ -1286,7 +1470,7 @@
           <w:rFonts w:ascii="Consolas" w:hAnsi="Consolas"/>
           <w:sz w:val="20"/>
         </w:rPr>
-        <w:t>масса (кг) = скорость_подачи (м/мин) × плотность (кг/м) × время_сварки (мин)</w:t>
+        <w:t>масса (кг) = Σ приростов_счётчика (м) × плотность (кг/м)</w:t>
       </w:r>
     </w:p>
     <w:p>
@@ -1303,7 +1487,7 @@
         <w:rPr>
           <w:b w:val="0"/>
         </w:rPr>
-        <w:t xml:space="preserve">Сумма по всем сварочным отрезкам округляется до 5 знаков и сохраняется как </w:t>
+        <w:t xml:space="preserve">Метры × плотность, округление до 5 знаков, сохраняется как </w:t>
       </w:r>
       <w:r>
         <w:rPr>
@@ -1317,7 +1501,35 @@
         <w:rPr>
           <w:b w:val="0"/>
         </w:rPr>
-        <w:t>.</w:t>
+        <w:t xml:space="preserve">. Плотность фиксирована под сталь Ø1.2 мм; апгрейд — таблица плотностей по диаметру/материалу (в пакете есть </w:t>
+      </w:r>
+      <w:r>
+        <w:rPr>
+          <w:rFonts w:ascii="Consolas" w:hAnsi="Consolas"/>
+          <w:b w:val="0"/>
+          <w:sz w:val="20"/>
+        </w:rPr>
+        <w:t>weldingWireDiameter</w:t>
+      </w:r>
+      <w:r>
+        <w:rPr>
+          <w:b w:val="0"/>
+        </w:rPr>
+        <w:t>/</w:t>
+      </w:r>
+      <w:r>
+        <w:rPr>
+          <w:rFonts w:ascii="Consolas" w:hAnsi="Consolas"/>
+          <w:b w:val="0"/>
+          <w:sz w:val="20"/>
+        </w:rPr>
+        <w:t>weldingMaterial</w:t>
+      </w:r>
+      <w:r>
+        <w:rPr>
+          <w:b w:val="0"/>
+        </w:rPr>
+        <w:t>).</w:t>
       </w:r>
     </w:p>
     <w:p>

</xml_diff>